<commit_message>
Assigned Tasks and Folder Structure Set
</commit_message>
<xml_diff>
--- a/DF_TermProject_Spring2026.docx
+++ b/DF_TermProject_Spring2026.docx
@@ -444,14 +444,14 @@
         <w:tblLook w:val="04A0" w:firstRow="1" w:lastRow="0" w:firstColumn="1" w:lastColumn="0" w:noHBand="0" w:noVBand="1"/>
       </w:tblPr>
       <w:tblGrid>
-        <w:gridCol w:w="452"/>
-        <w:gridCol w:w="985"/>
-        <w:gridCol w:w="1208"/>
-        <w:gridCol w:w="1663"/>
-        <w:gridCol w:w="1141"/>
-        <w:gridCol w:w="1141"/>
-        <w:gridCol w:w="974"/>
-        <w:gridCol w:w="1441"/>
+        <w:gridCol w:w="413"/>
+        <w:gridCol w:w="1195"/>
+        <w:gridCol w:w="1788"/>
+        <w:gridCol w:w="1409"/>
+        <w:gridCol w:w="1205"/>
+        <w:gridCol w:w="1998"/>
+        <w:gridCol w:w="843"/>
+        <w:gridCol w:w="1227"/>
       </w:tblGrid>
       <w:tr>
         <w:tc>
@@ -746,7 +746,11 @@
             </w:tcMar>
             <w:vAlign w:val="center"/>
           </w:tcPr>
-          <w:p/>
+          <w:p>
+            <w:r>
+              <w:t>1</w:t>
+            </w:r>
+          </w:p>
         </w:tc>
         <w:tc>
           <w:tcPr>
@@ -766,7 +770,11 @@
             </w:tcMar>
             <w:vAlign w:val="center"/>
           </w:tcPr>
-          <w:p/>
+          <w:p>
+            <w:r>
+              <w:t>Muhammad Shahroz Butt</w:t>
+            </w:r>
+          </w:p>
         </w:tc>
         <w:tc>
           <w:tcPr>
@@ -786,7 +794,11 @@
             </w:tcMar>
             <w:vAlign w:val="center"/>
           </w:tcPr>
-          <w:p/>
+          <w:p>
+            <w:r>
+              <w:t>ShahrozButtOfficial</w:t>
+            </w:r>
+          </w:p>
         </w:tc>
         <w:tc>
           <w:tcPr>
@@ -806,7 +818,11 @@
             </w:tcMar>
             <w:vAlign w:val="center"/>
           </w:tcPr>
-          <w:p/>
+          <w:p>
+            <w:r>
+              <w:t>TL</w:t>
+            </w:r>
+          </w:p>
         </w:tc>
         <w:tc>
           <w:tcPr>
@@ -826,7 +842,11 @@
             </w:tcMar>
             <w:vAlign w:val="center"/>
           </w:tcPr>
-          <w:p/>
+          <w:p>
+            <w:r>
+              <w:t>ci-dev.yml,cd-prod.yml</w:t>
+            </w:r>
+          </w:p>
         </w:tc>
         <w:tc>
           <w:tcPr>
@@ -846,7 +866,11 @@
             </w:tcMar>
             <w:vAlign w:val="center"/>
           </w:tcPr>
-          <w:p/>
+          <w:p>
+            <w:r>
+              <w:t>Index.html</w:t>
+            </w:r>
+          </w:p>
         </w:tc>
         <w:tc>
           <w:tcPr>
@@ -908,7 +932,11 @@
             </w:tcMar>
             <w:vAlign w:val="center"/>
           </w:tcPr>
-          <w:p/>
+          <w:p>
+            <w:r>
+              <w:t>2</w:t>
+            </w:r>
+          </w:p>
         </w:tc>
         <w:tc>
           <w:tcPr>
@@ -928,7 +956,11 @@
             </w:tcMar>
             <w:vAlign w:val="center"/>
           </w:tcPr>
-          <w:p/>
+          <w:p>
+            <w:r>
+              <w:t>Azan Awan</w:t>
+            </w:r>
+          </w:p>
         </w:tc>
         <w:tc>
           <w:tcPr>
@@ -948,7 +980,11 @@
             </w:tcMar>
             <w:vAlign w:val="center"/>
           </w:tcPr>
-          <w:p/>
+          <w:p>
+            <w:r>
+              <w:t>Azanawan01</w:t>
+            </w:r>
+          </w:p>
         </w:tc>
         <w:tc>
           <w:tcPr>
@@ -968,7 +1004,11 @@
             </w:tcMar>
             <w:vAlign w:val="center"/>
           </w:tcPr>
-          <w:p/>
+          <w:p>
+            <w:r>
+              <w:t>Member</w:t>
+            </w:r>
+          </w:p>
         </w:tc>
         <w:tc>
           <w:tcPr>
@@ -988,7 +1028,11 @@
             </w:tcMar>
             <w:vAlign w:val="center"/>
           </w:tcPr>
-          <w:p/>
+          <w:p>
+            <w:r>
+              <w:t>cd-dev.yml</w:t>
+            </w:r>
+          </w:p>
         </w:tc>
         <w:tc>
           <w:tcPr>
@@ -1008,7 +1052,11 @@
             </w:tcMar>
             <w:vAlign w:val="center"/>
           </w:tcPr>
-          <w:p/>
+          <w:p>
+            <w:r>
+              <w:t>Lahore,html</w:t>
+            </w:r>
+          </w:p>
         </w:tc>
         <w:tc>
           <w:tcPr>
@@ -1070,7 +1118,11 @@
             </w:tcMar>
             <w:vAlign w:val="center"/>
           </w:tcPr>
-          <w:p/>
+          <w:p>
+            <w:r>
+              <w:t>3</w:t>
+            </w:r>
+          </w:p>
         </w:tc>
         <w:tc>
           <w:tcPr>
@@ -1090,7 +1142,11 @@
             </w:tcMar>
             <w:vAlign w:val="center"/>
           </w:tcPr>
-          <w:p/>
+          <w:p>
+            <w:r>
+              <w:t>Abdullah Nazir</w:t>
+            </w:r>
+          </w:p>
         </w:tc>
         <w:tc>
           <w:tcPr>
@@ -1110,7 +1166,11 @@
             </w:tcMar>
             <w:vAlign w:val="center"/>
           </w:tcPr>
-          <w:p/>
+          <w:p>
+            <w:r>
+              <w:t>AbdullahNazir0</w:t>
+            </w:r>
+          </w:p>
         </w:tc>
         <w:tc>
           <w:tcPr>
@@ -1130,7 +1190,11 @@
             </w:tcMar>
             <w:vAlign w:val="center"/>
           </w:tcPr>
-          <w:p/>
+          <w:p>
+            <w:r>
+              <w:t>Member</w:t>
+            </w:r>
+          </w:p>
         </w:tc>
         <w:tc>
           <w:tcPr>
@@ -1150,7 +1214,17 @@
             </w:tcMar>
             <w:vAlign w:val="center"/>
           </w:tcPr>
-          <w:p/>
+          <w:p>
+            <w:r>
+              <w:t>ci-staging.yml</w:t>
+            </w:r>
+            <w:r>
+              <w:t xml:space="preserve">, </w:t>
+            </w:r>
+            <w:r>
+              <w:t>cd-staging.yml</w:t>
+            </w:r>
+          </w:p>
         </w:tc>
         <w:tc>
           <w:tcPr>
@@ -1170,7 +1244,11 @@
             </w:tcMar>
             <w:vAlign w:val="center"/>
           </w:tcPr>
-          <w:p/>
+          <w:p>
+            <w:r>
+              <w:t>Hunza.html,Swat.html</w:t>
+            </w:r>
+          </w:p>
         </w:tc>
         <w:tc>
           <w:tcPr>
@@ -1232,7 +1310,11 @@
             </w:tcMar>
             <w:vAlign w:val="center"/>
           </w:tcPr>
-          <w:p/>
+          <w:p>
+            <w:r>
+              <w:t>4</w:t>
+            </w:r>
+          </w:p>
         </w:tc>
         <w:tc>
           <w:tcPr>
@@ -1252,7 +1334,11 @@
             </w:tcMar>
             <w:vAlign w:val="center"/>
           </w:tcPr>
-          <w:p/>
+          <w:p>
+            <w:r>
+              <w:t>Rai Muhammad Abdullah</w:t>
+            </w:r>
+          </w:p>
         </w:tc>
         <w:tc>
           <w:tcPr>
@@ -1272,7 +1358,11 @@
             </w:tcMar>
             <w:vAlign w:val="center"/>
           </w:tcPr>
-          <w:p/>
+          <w:p>
+            <w:r>
+              <w:t>Lollip137-bit</w:t>
+            </w:r>
+          </w:p>
         </w:tc>
         <w:tc>
           <w:tcPr>
@@ -1292,7 +1382,11 @@
             </w:tcMar>
             <w:vAlign w:val="center"/>
           </w:tcPr>
-          <w:p/>
+          <w:p>
+            <w:r>
+              <w:t>Member</w:t>
+            </w:r>
+          </w:p>
         </w:tc>
         <w:tc>
           <w:tcPr>
@@ -1312,7 +1406,11 @@
             </w:tcMar>
             <w:vAlign w:val="center"/>
           </w:tcPr>
-          <w:p/>
+          <w:p>
+            <w:r>
+              <w:t>ci-prod.yml</w:t>
+            </w:r>
+          </w:p>
         </w:tc>
         <w:tc>
           <w:tcPr>
@@ -1332,7 +1430,11 @@
             </w:tcMar>
             <w:vAlign w:val="center"/>
           </w:tcPr>
-          <w:p/>
+          <w:p>
+            <w:r>
+              <w:t>Karachi.html</w:t>
+            </w:r>
+          </w:p>
         </w:tc>
         <w:tc>
           <w:tcPr>
@@ -1549,7 +1651,49 @@
           <w:bCs/>
           <w:color w:val="1F3864"/>
         </w:rPr>
-        <w:t xml:space="preserve">Group Repository URL: </w:t>
+        <w:t>Group Repository URL:</w:t>
+      </w:r>
+      <w:r>
+        <w:rPr>
+          <w:b/>
+          <w:bCs/>
+          <w:color w:val="1F3864"/>
+        </w:rPr>
+        <w:t xml:space="preserve"> </w:t>
+      </w:r>
+      <w:r>
+        <w:rPr>
+          <w:b/>
+          <w:bCs/>
+          <w:color w:val="1F3864"/>
+        </w:rPr>
+        <w:t>https://github.com/ShahrozButtOfficial/Term-Project-DevOps-.git</w:t>
+      </w:r>
+    </w:p>
+    <w:p/>
+    <w:p>
+      <w:pPr>
+        <w:spacing w:before="60" w:after="60" w:line="276" w:lineRule="auto"/>
+      </w:pPr>
+      <w:r>
+        <w:rPr>
+          <w:b/>
+          <w:bCs/>
+          <w:color w:val="1F3864"/>
+        </w:rPr>
+        <w:t>Deployed Application URLs:</w:t>
+      </w:r>
+    </w:p>
+    <w:p>
+      <w:pPr>
+        <w:spacing w:before="60" w:after="60" w:line="276" w:lineRule="auto"/>
+      </w:pPr>
+      <w:r>
+        <w:rPr>
+          <w:b/>
+          <w:bCs/>
+        </w:rPr>
+        <w:t xml:space="preserve">  Development: </w:t>
       </w:r>
       <w:r>
         <w:rPr>
@@ -1557,10 +1701,9 @@
           <w:iCs/>
           <w:color w:val="595959"/>
         </w:rPr>
-        <w:t>[Paste Your GitHub Repository URL Here]</w:t>
-      </w:r>
-    </w:p>
-    <w:p/>
+        <w:t>[Paste Render Development Service URL Here]</w:t>
+      </w:r>
+    </w:p>
     <w:p>
       <w:pPr>
         <w:spacing w:before="60" w:after="60" w:line="276" w:lineRule="auto"/>
@@ -1569,21 +1712,8 @@
         <w:rPr>
           <w:b/>
           <w:bCs/>
-          <w:color w:val="1F3864"/>
-        </w:rPr>
-        <w:t>Deployed Application URLs:</w:t>
-      </w:r>
-    </w:p>
-    <w:p>
-      <w:pPr>
-        <w:spacing w:before="60" w:after="60" w:line="276" w:lineRule="auto"/>
-      </w:pPr>
-      <w:r>
-        <w:rPr>
-          <w:b/>
-          <w:bCs/>
-        </w:rPr>
-        <w:t xml:space="preserve">  Development: </w:t>
+        </w:rPr>
+        <w:t xml:space="preserve">  Staging:     </w:t>
       </w:r>
       <w:r>
         <w:rPr>
@@ -1591,7 +1721,7 @@
           <w:iCs/>
           <w:color w:val="595959"/>
         </w:rPr>
-        <w:t>[Paste Render Development Service URL Here]</w:t>
+        <w:t>[Paste Render Staging Service URL Here]</w:t>
       </w:r>
     </w:p>
     <w:p>
@@ -1603,7 +1733,7 @@
           <w:b/>
           <w:bCs/>
         </w:rPr>
-        <w:t xml:space="preserve">  Staging:     </w:t>
+        <w:t xml:space="preserve">  Production:  </w:t>
       </w:r>
       <w:r>
         <w:rPr>
@@ -1611,7 +1741,16 @@
           <w:iCs/>
           <w:color w:val="595959"/>
         </w:rPr>
-        <w:t>[Paste Render Staging Service URL Here]</w:t>
+        <w:t>[Paste Render Production Service URL Here]</w:t>
+      </w:r>
+    </w:p>
+    <w:p/>
+    <w:p>
+      <w:pPr>
+        <w:pStyle w:val="Heading1"/>
+      </w:pPr>
+      <w:r>
+        <w:t>SCENARIO</w:t>
       </w:r>
     </w:p>
     <w:p>
@@ -1619,35 +1758,7 @@
         <w:spacing w:before="60" w:after="60" w:line="276" w:lineRule="auto"/>
       </w:pPr>
       <w:r>
-        <w:rPr>
-          <w:b/>
-          <w:bCs/>
-        </w:rPr>
-        <w:t xml:space="preserve">  Production:  </w:t>
-      </w:r>
-      <w:r>
-        <w:rPr>
-          <w:i/>
-          <w:iCs/>
-          <w:color w:val="595959"/>
-        </w:rPr>
-        <w:t>[Paste Render Production Service URL Here]</w:t>
-      </w:r>
-    </w:p>
-    <w:p/>
-    <w:p>
-      <w:pPr>
-        <w:pStyle w:val="Heading1"/>
-      </w:pPr>
-      <w:r>
-        <w:t>SCENARIO</w:t>
-      </w:r>
-    </w:p>
-    <w:p>
-      <w:pPr>
-        <w:spacing w:before="60" w:after="60" w:line="276" w:lineRule="auto"/>
-      </w:pPr>
-      <w:r>
+        <w:lastRenderedPageBreak/>
         <w:t xml:space="preserve">Your team is the engineering crew for </w:t>
       </w:r>
       <w:r>
@@ -1871,7 +1982,6 @@
                 <w:sz w:val="20"/>
                 <w:szCs w:val="20"/>
               </w:rPr>
-              <w:lastRenderedPageBreak/>
               <w:t>Development</w:t>
             </w:r>
           </w:p>
@@ -3019,6 +3129,7 @@
         <w:pStyle w:val="Heading2"/>
       </w:pPr>
       <w:r>
+        <w:lastRenderedPageBreak/>
         <w:t>Table 3: Workflow File Assignment</w:t>
       </w:r>
     </w:p>
@@ -3387,16 +3498,7 @@
                 <w:sz w:val="20"/>
                 <w:szCs w:val="20"/>
               </w:rPr>
-              <w:t xml:space="preserve"> HTML &amp; CSS Linting, Building with </w:t>
-            </w:r>
-            <w:r>
-              <w:rPr>
-                <w:color w:val="000000"/>
-                <w:sz w:val="20"/>
-                <w:szCs w:val="20"/>
-              </w:rPr>
-              <w:lastRenderedPageBreak/>
-              <w:t>Parcel,</w:t>
+              <w:t xml:space="preserve"> HTML &amp; CSS Linting, Building with Parcel,</w:t>
             </w:r>
             <w:r>
               <w:rPr>
@@ -3440,7 +3542,6 @@
                 <w:sz w:val="20"/>
                 <w:szCs w:val="20"/>
               </w:rPr>
-              <w:lastRenderedPageBreak/>
               <w:t>2</w:t>
             </w:r>
           </w:p>
@@ -4355,6 +4456,7 @@
         <w:rPr>
           <w:color w:val="000000"/>
         </w:rPr>
+        <w:lastRenderedPageBreak/>
         <w:t>Complete automated flow:</w:t>
       </w:r>
     </w:p>
@@ -16022,7 +16124,6 @@
   <w:style w:type="character" w:default="1" w:styleId="DefaultParagraphFont">
     <w:name w:val="Default Paragraph Font"/>
     <w:uiPriority w:val="1"/>
-    <w:semiHidden/>
     <w:unhideWhenUsed/>
   </w:style>
   <w:style w:type="table" w:default="1" w:styleId="TableNormal">
@@ -16136,6 +16237,18 @@
     <w:rPr>
       <w:sz w:val="20"/>
       <w:szCs w:val="20"/>
+    </w:rPr>
+  </w:style>
+  <w:style w:type="character" w:styleId="UnresolvedMention">
+    <w:name w:val="Unresolved Mention"/>
+    <w:basedOn w:val="DefaultParagraphFont"/>
+    <w:uiPriority w:val="99"/>
+    <w:semiHidden/>
+    <w:unhideWhenUsed/>
+    <w:rsid w:val="00BD4C92"/>
+    <w:rPr>
+      <w:color w:val="605E5C"/>
+      <w:shd w:val="clear" w:color="auto" w:fill="E1DFDD"/>
     </w:rPr>
   </w:style>
 </w:styles>

</xml_diff>